<commit_message>
promote local -> dev (2026-09-14T14:35:39.573049+00:00)
</commit_message>
<xml_diff>
--- a/architecture/EngineeringRuleEnforcement/ArchitectureDesignAndAuditDocs/CH-EPIC8-Feachure-002-EngineeringRulesEnforcement-designV32.docx
+++ b/architecture/EngineeringRuleEnforcement/ArchitectureDesignAndAuditDocs/CH-EPIC8-Feachure-002-EngineeringRulesEnforcement-designV32.docx
@@ -5466,7 +5466,7 @@
           <w:rFonts w:cs="Calibri"/>
           <w:color w:val="000000"/>
         </w:rPr>
-        <w:t>The second line of defense is the per-worker timeout, and it is enforced exclusively by the manager. When the manager dispatches a worker via subprocess, it reads the enforcement entry's optional timeout field (integer seconds) and falls back to the manager class constant DEFAULT_TIMEOUT_SECONDS — currently 30 — when the field is omitted. The resolved value is passed to subprocess.run(..., timeout=N). On timeout the manager kills the worker subprocess, catches subprocess.TimeoutExpired, and records EXIT_WORKER_TIMEOUT (4) for that worker. The other workers in the same dispatch are unaffected — they continue to completion, and the manager aggregates their outcomes alongside the timeout. Workers MUST NOT install signal handlers, watchdog threads, or any other in-process timeout mechanism. There is no second path. If a worker needs graceful internal cleanup before forced termination, that is a worker-internal nicety; it does not replace the manager's hard kill.</w:t>
+        <w:t>The second line of defense is the per-worker timeout, and it is enforced exclusively by the manager. When the manager dispatches a worker via subprocess, it reads the enforcement entry's optional timeout field (integer seconds) and falls back to the manager class constant DEFAULT_TIMEOUT_SECONDS — currently 30 — when the field is omitted. The resolved value is passed to subprocess.run(..., timeout=N). On timeout the manager kills the worker subprocess, catches subprocess.TimeoutExpired, and records EXIT_WORKER_TIMEOUT (4) for that worker. The other workers in the same dispatch are unaffected — they continue to completion, and the manager aggregates their outcomes alongside the timeout. Workers MUST NOT install signal handlers, watchdog threads, or any other in-process timeout mechanism. There is no second path. If a worker needs graceful internal cleanup before forced termination, that is a worker-internal nicety; it does not replace the manager's hard kill. There is one timeout for every enforcement, five hours, declared once as ChatHealthyEnforcementManager.DEFAULT_TIMEOUT_SECONDS. No enforcement entry declares its own. The manager hands it to every worker through CHATHEALTHY_ENFORCEMENT_TIMEOUT_SECONDS and the base class exposes it as self.timeout_seconds, because a worker that waits on a human must expire on that budget itself: it then refuses and records the refusal, where the manager's kill refuses nothing and records nothing. On PreToolUse a refusal is a decision on stdout and not an exit code, so the manager emits the denial itself when a worker is killed. Every timeout, at either level, is a rejection.</w:t>
       </w:r>
     </w:p>
     <w:p>
@@ -20087,7 +20087,7 @@
         <w:rPr>
           <w:color w:val="000000"/>
         </w:rPr>
-        <w:t>Rule-006 remains disabled (BUG-002). This design deploys the enforcements that exist and does not restore it.</w:t>
+        <w:t>Rule-006 carries one enforcement, Rule-006-ENF-001 on PreToolUse, realized by architecture/EngineeringRuleEnforcement/code/git_state_change_authorization_worker.py. It is one class with no base class. The hook registers no tool matcher: every command reaches the worker and the worker decides what it cares about.</w:t>
       </w:r>
     </w:p>
     <w:p>
@@ -20973,7 +20973,7 @@
         <w:rPr>
           <w:color w:val="000000"/>
         </w:rPr>
-        <w:t>ID: Rule-001-ENF-001 | Hook: UserPromptSubmit | Worker: architecture/Conversation-logPipeline/conversation_log_publisher_worker.py | Timeout: 15s</w:t>
+        <w:t>ID: Rule-001-ENF-001 | Hook: UserPromptSubmit | Worker: architecture/Conversation-logPipeline/conversation_log_publisher_worker.py | Timeout: the one budget, five hours, held by the manager</w:t>
       </w:r>
     </w:p>
     <w:p>
@@ -20984,7 +20984,7 @@
         <w:rPr>
           <w:color w:val="000000"/>
         </w:rPr>
-        <w:t>ID: Rule-001-ENF-002 | Hook: Stop | Worker: architecture/Conversation-logPipeline/conversation_log_publisher_worker.py | Timeout: 15s</w:t>
+        <w:t>ID: Rule-001-ENF-002 | Hook: Stop | Worker: architecture/Conversation-logPipeline/conversation_log_publisher_worker.py | Timeout: the one budget, five hours, held by the manager</w:t>
       </w:r>
     </w:p>
     <w:p>
@@ -21073,7 +21073,7 @@
         <w:rPr>
           <w:color w:val="000000"/>
         </w:rPr>
-        <w:t>ID: Rule-002-ENF-001 | Hook: SessionStart | Worker: Code/Shared/ops/tools/chathealthy_devops_boot.py | Timeout: 30s</w:t>
+        <w:t>ID: Rule-002-ENF-001 | Hook: SessionStart | Worker: Code/Shared/ops/tools/chathealthy_devops_boot.py | Timeout: the one budget, five hours, held by the manager</w:t>
       </w:r>
     </w:p>
     <w:p>
@@ -21084,7 +21084,7 @@
         <w:rPr>
           <w:color w:val="000000"/>
         </w:rPr>
-        <w:t>ID: Rule-002-ENF-002 | Hook: PostCompact | Worker: Code/Shared/ops/tools/chathealthy_devops_boot.py | Timeout: 30s</w:t>
+        <w:t>ID: Rule-002-ENF-002 | Hook: PostCompact | Worker: Code/Shared/ops/tools/chathealthy_devops_boot.py | Timeout: the one budget, five hours, held by the manager</w:t>
       </w:r>
     </w:p>
     <w:p>
@@ -21172,7 +21172,7 @@
         <w:rPr>
           <w:color w:val="000000"/>
         </w:rPr>
-        <w:t>ID: Rule-003-ENF-001 | Hook: pre-commit | Worker: architecture/EngineeringRuleEnforcement/code/scan_deliberate_raises_enforcement_worker.py | Timeout: 30s</w:t>
+        <w:t>ID: Rule-003-ENF-001 | Hook: pre-commit | Worker: architecture/EngineeringRuleEnforcement/code/scan_deliberate_raises_enforcement_worker.py | Timeout: the one budget, five hours, held by the manager</w:t>
       </w:r>
     </w:p>
     <w:p>
@@ -21261,7 +21261,7 @@
         <w:rPr>
           <w:color w:val="000000"/>
         </w:rPr>
-        <w:t>ID: Rule-004-ENF-001 | Hook: pre-commit | Worker: architecture/EngineeringRuleEnforcement/code/scan_mongo_client_direct_access_worker.py | Timeout: 30s</w:t>
+        <w:t>ID: Rule-004-ENF-001 | Hook: pre-commit | Worker: architecture/EngineeringRuleEnforcement/code/scan_mongo_client_direct_access_worker.py | Timeout: the one budget, five hours, held by the manager</w:t>
       </w:r>
     </w:p>
     <w:p>
@@ -21349,7 +21349,7 @@
         <w:rPr>
           <w:color w:val="000000"/>
         </w:rPr>
-        <w:t>ID: Rule-005-ENF-001 | Hook: pre-commit | Worker: architecture/EngineeringRuleEnforcement/code/scan_uniform_logging_worker.py | Timeout: 30s</w:t>
+        <w:t>ID: Rule-005-ENF-001 | Hook: pre-commit | Worker: architecture/EngineeringRuleEnforcement/code/scan_uniform_logging_worker.py | Timeout: the one budget, five hours, held by the manager</w:t>
       </w:r>
     </w:p>
     <w:p>
@@ -21526,7 +21526,7 @@
         <w:rPr>
           <w:color w:val="000000"/>
         </w:rPr>
-        <w:t>ID: Rule-007-ENF-001 | Hook: pre-commit | Worker: architecture/EngineeringRuleEnforcement/code/identity_approval_worker.py | Timeout: 900s</w:t>
+        <w:t>ID: Rule-007-ENF-001 | Hook: pre-commit | Worker: architecture/EngineeringRuleEnforcement/code/identity_approval_worker.py | Timeout: the one budget, five hours, held by the manager</w:t>
       </w:r>
     </w:p>
     <w:p>
@@ -21614,7 +21614,7 @@
         <w:rPr>
           <w:color w:val="000000"/>
         </w:rPr>
-        <w:t>ID: Rule-008-ENF-001 | Hook: pre-commit | Worker: architecture/EngineeringRuleEnforcement/code/scan_files_enforcement_worker.py | Timeout: 60s</w:t>
+        <w:t>ID: Rule-008-ENF-001 | Hook: pre-commit | Worker: architecture/EngineeringRuleEnforcement/code/scan_files_enforcement_worker.py | Timeout: the one budget, five hours, held by the manager</w:t>
       </w:r>
     </w:p>
     <w:p>
@@ -21675,7 +21675,7 @@
         <w:pStyle w:val="ListBullet"/>
       </w:pPr>
       <w:r>
-        <w:t>Worker: architecture/EngineeringRuleEnforcement/code/scan_separation_of_concerns_worker.py | Timeout: 120s</w:t>
+        <w:t>Worker: architecture/EngineeringRuleEnforcement/code/scan_separation_of_concerns_worker.py | Timeout: the one budget, five hours, held by the manager</w:t>
       </w:r>
     </w:p>
     <w:p>
@@ -21923,8 +21923,7 @@
         <w:rPr>
           <w:color w:val="000000"/>
         </w:rPr>
-        <w:lastRenderedPageBreak/>
-        <w:t>ID: Rule-066-ENF-001 | Hook: pre-commit | Worker: architecture/EngineeringRuleEnforcement/code/scan_entrypoint_uniqueness_worker.py | Timeout: 10s</w:t>
+        <w:t>ID: Rule-066-ENF-001 | Hook: pre-commit | Worker: architecture/EngineeringRuleEnforcement/code/scan_entrypoint_uniqueness_worker.py | Timeout: the one budget, five hours, held by the manager</w:t>
       </w:r>
     </w:p>
     <w:p>

</xml_diff>